<commit_message>
BA Timlak Konsultan Otomatis Done
</commit_message>
<xml_diff>
--- a/Master Folder/Master BA Timlak Konsultan/!Daftar Hadir.docx
+++ b/Master Folder/Master BA Timlak Konsultan/!Daftar Hadir.docx
@@ -202,9 +202,8 @@
         <w:rPr>
           <w:sz w:val="28"/>
           <w:szCs w:val="28"/>
-          <w:lang w:val="id-ID"/>
         </w:rPr>
-        <w:t>DH</w:t>
+        <w:t>reviu</w:t>
       </w:r>
       <w:r>
         <w:rPr>
@@ -273,7 +272,24 @@
           <w:szCs w:val="28"/>
           <w:lang w:val="id-ID"/>
         </w:rPr>
-        <w:t>{tanggal_DH}</w:t>
+        <w:t>{tanggal_</w:t>
+      </w:r>
+      <w:r>
+        <w:rPr>
+          <w:color w:val="000000" w:themeColor="text1"/>
+          <w:sz w:val="28"/>
+          <w:szCs w:val="28"/>
+        </w:rPr>
+        <w:t>reviu</w:t>
+      </w:r>
+      <w:r>
+        <w:rPr>
+          <w:color w:val="000000" w:themeColor="text1"/>
+          <w:sz w:val="28"/>
+          <w:szCs w:val="28"/>
+          <w:lang w:val="id-ID"/>
+        </w:rPr>
+        <w:t>}</w:t>
       </w:r>
     </w:p>
     <w:p>

</xml_diff>